<commit_message>
fix(juridico): el análisis pide los datos del representante, no los personales de la empresa
- Pasar a 80% (análisis y cambio de etapa) usa la misma regla que jurídico
  (`faltantesDelRepresentante`): de una empresa sólo la dirección, y del
  representante legal DPI, correo, celular, género, edad y estado civil.
- Generar revisa el titular que mandó la pantalla contra el representante de
  hoy antes de crear nada en WeeTrust.
- La carta de emisión de cheques de sociedad nombra a la sociedad y la calidad
  del representante; el catálogo enlaza esos dos campos (docs 51 y 52).

Co-Authored-By: Claude Opus 5.5 <noreply@anthropic.com>
</commit_message>
<xml_diff>
--- a/apps/legal-docs-blueprints/templates/ventas_sociedad/carta_emision_cheques_sociedad/carta_emision_cheques_sociedad-mujer.docx
+++ b/apps/legal-docs-blueprints/templates/ventas_sociedad/carta_emision_cheques_sociedad/carta_emision_cheques_sociedad-mujer.docx
@@ -690,7 +690,44 @@
           <w:vertAlign w:val="baseline"/>
           <w:rtl w:val="0"/>
         </w:rPr>
-        <w:t xml:space="preserve">En referencia al Contrato de Reconocimiento de Deuda celebrado entre {tipoEntidad}: {entidad}, y mi persona</w:t>
+        <w:t xml:space="preserve">En referencia al Contrato de Reconocimiento de Deuda celebrado entre {tipoEntidad}: {entidad}, y mi persona, en forma personal y en mi calidad de {cargoRepresentanteLegal} de la entidad denominada </w:t>
+      </w:r>
+      <w:r>
+        <w:rPr>
+          <w:rFonts w:ascii="Arial" w:cs="Arial" w:eastAsia="Arial" w:hAnsi="Arial"/>
+          <w:b/>
+          <w:bCs/>
+          <w:i w:val="0"/>
+          <w:iCs w:val="0"/>
+          <w:smallCaps w:val="0"/>
+          <w:strike w:val="0"/>
+          <w:color w:val="000000"/>
+          <w:sz w:val="20"/>
+          <w:szCs w:val="20"/>
+          <w:shd w:fill="auto" w:val="clear"/>
+          <w:vertAlign w:val="baseline"/>
+          <w:rtl w:val="0"/>
+        </w:rPr>
+        <w:t xml:space="preserve">{nombreSociedad}</w:t>
+      </w:r>
+      <w:r>
+        <w:rPr>
+          <w:rFonts w:ascii="Arial" w:cs="Arial" w:eastAsia="Arial" w:hAnsi="Arial"/>
+          <w:b w:val="0"/>
+          <w:bCs w:val="0"/>
+          <w:i w:val="0"/>
+          <w:iCs w:val="0"/>
+          <w:smallCaps w:val="0"/>
+          <w:strike w:val="0"/>
+          <w:color w:val="000000"/>
+          <w:sz w:val="20"/>
+          <w:szCs w:val="20"/>
+          <w:u w:val="none"/>
+          <w:shd w:fill="auto" w:val="clear"/>
+          <w:vertAlign w:val="baseline"/>
+          <w:rtl w:val="0"/>
+        </w:rPr>
+        <w:t xml:space="preserve">, el día</w:t>
       </w:r>
       <w:r>
         <w:rPr>
@@ -728,7 +765,7 @@
           <w:vertAlign w:val="baseline"/>
           <w:rtl w:val="0"/>
         </w:rPr>
-        <w:t xml:space="preserve"> el día </w:t>
+        <w:t xml:space="preserve"> </w:t>
       </w:r>
       <w:r>
         <w:rPr>

</xml_diff>